<commit_message>
Update education to IIIT Chennai, remove Mechanical Engineering, add Data Engineer role
Co-Authored-By: Claude Sonnet 4.6 <noreply@anthropic.com>
</commit_message>
<xml_diff>
--- a/public/Rohit_Ananthan_Resume.docx
+++ b/public/Rohit_Ananthan_Resume.docx
@@ -783,7 +783,7 @@
           <w:sz w:val="19"/>
           <w:szCs w:val="19"/>
         </w:rPr>
-        <w:t xml:space="preserve">IIITDM Kancheepuram</w:t>
+        <w:t xml:space="preserve">IIIT Chennai</w:t>
       </w:r>
       <w:r>
         <w:rPr>
@@ -816,7 +816,7 @@
           <w:sz w:val="18"/>
           <w:szCs w:val="18"/>
         </w:rPr>
-        <w:t xml:space="preserve">B.Tech, Mechanical Engineering with Smart Manufacturing</w:t>
+        <w:t xml:space="preserve">B.Tech, Engineering</w:t>
       </w:r>
     </w:p>
     <w:p>

</xml_diff>